<commit_message>
update magang & bug parents
</commit_message>
<xml_diff>
--- a/docs/FORM PENGAJUAN SURAT PENGANTAR MAGANG.docx
+++ b/docs/FORM PENGAJUAN SURAT PENGANTAR MAGANG.docx
@@ -426,31 +426,15 @@
           <w:sz w:val="24"/>
           <w:szCs w:val="24"/>
         </w:rPr>
-        <w:t>Semester Gasal Tahun Ajaran 202</w:t>
-      </w:r>
-      <w:r>
-        <w:rPr>
-          <w:rFonts w:ascii="Arial" w:hAnsi="Arial" w:cs="Arial"/>
-          <w:sz w:val="24"/>
-          <w:szCs w:val="24"/>
-        </w:rPr>
-        <w:t>5</w:t>
-      </w:r>
-      <w:r>
-        <w:rPr>
-          <w:rFonts w:ascii="Arial" w:hAnsi="Arial" w:cs="Arial"/>
-          <w:sz w:val="24"/>
-          <w:szCs w:val="24"/>
-        </w:rPr>
-        <w:t>/202</w:t>
-      </w:r>
-      <w:r>
-        <w:rPr>
-          <w:rFonts w:ascii="Arial" w:hAnsi="Arial" w:cs="Arial"/>
-          <w:sz w:val="24"/>
-          <w:szCs w:val="24"/>
-        </w:rPr>
-        <w:t>6</w:t>
+        <w:t xml:space="preserve">Semester Gasal Tahun Ajaran </w:t>
+      </w:r>
+      <w:r>
+        <w:rPr>
+          <w:rFonts w:ascii="Arial" w:hAnsi="Arial" w:cs="Arial"/>
+          <w:sz w:val="24"/>
+          <w:szCs w:val="24"/>
+        </w:rPr>
+        <w:t>......</w:t>
       </w:r>
       <w:r>
         <w:rPr>
@@ -998,7 +982,7 @@
       <w:rPr>
         <w:noProof/>
       </w:rPr>
-      <w:pict w14:anchorId="3E81416F">
+      <w:pict w14:anchorId="112E50A3">
         <v:shapetype id="_x0000_t75" coordsize="21600,21600" o:spt="75" o:preferrelative="t" path="m@4@5l@4@11@9@11@9@5xe" filled="f" stroked="f">
           <v:stroke joinstyle="miter"/>
           <v:formulas>
@@ -1018,7 +1002,7 @@
           <v:path o:extrusionok="f" gradientshapeok="t" o:connecttype="rect"/>
           <o:lock v:ext="edit" aspectratio="t"/>
         </v:shapetype>
-        <v:shape id="WordPictureWatermark599527313" o:spid="_x0000_s1026" type="#_x0000_t75" style="position:absolute;margin-left:0;margin-top:0;width:466.35pt;height:466.25pt;z-index:-251655168;mso-position-horizontal:center;mso-position-horizontal-relative:margin;mso-position-vertical:center;mso-position-vertical-relative:margin" o:allowincell="f">
+        <v:shape id="WordPictureWatermark599527313" o:spid="_x0000_s1027" type="#_x0000_t75" alt="" style="position:absolute;margin-left:0;margin-top:0;width:466.35pt;height:466.25pt;z-index:-251655168;mso-wrap-edited:f;mso-width-percent:0;mso-height-percent:0;mso-position-horizontal:center;mso-position-horizontal-relative:margin;mso-position-vertical:center;mso-position-vertical-relative:margin;mso-width-percent:0;mso-height-percent:0" o:allowincell="f">
           <v:imagedata r:id="rId1" o:title="LOGO STIHA ADHYAKSA-02 (1)" gain="19661f" blacklevel="22938f"/>
           <w10:wrap anchorx="margin" anchory="margin"/>
         </v:shape>
@@ -1039,7 +1023,7 @@
         <w:noProof/>
         <w:lang w:val="id-ID" w:eastAsia="id-ID"/>
       </w:rPr>
-      <w:pict w14:anchorId="53AD3D4F">
+      <w:pict w14:anchorId="6244A20D">
         <v:shapetype id="_x0000_t75" coordsize="21600,21600" o:spt="75" o:preferrelative="t" path="m@4@5l@4@11@9@11@9@5xe" filled="f" stroked="f">
           <v:stroke joinstyle="miter"/>
           <v:formulas>
@@ -1059,7 +1043,7 @@
           <v:path o:extrusionok="f" gradientshapeok="t" o:connecttype="rect"/>
           <o:lock v:ext="edit" aspectratio="t"/>
         </v:shapetype>
-        <v:shape id="WordPictureWatermark599527314" o:spid="_x0000_s1027" type="#_x0000_t75" style="position:absolute;margin-left:0;margin-top:0;width:466.35pt;height:466.25pt;z-index:-251654144;mso-position-horizontal:center;mso-position-horizontal-relative:margin;mso-position-vertical:center;mso-position-vertical-relative:margin" o:allowincell="f">
+        <v:shape id="WordPictureWatermark599527314" o:spid="_x0000_s1026" type="#_x0000_t75" alt="" style="position:absolute;margin-left:0;margin-top:0;width:466.35pt;height:466.25pt;z-index:-251654144;mso-wrap-edited:f;mso-width-percent:0;mso-height-percent:0;mso-position-horizontal:center;mso-position-horizontal-relative:margin;mso-position-vertical:center;mso-position-vertical-relative:margin;mso-width-percent:0;mso-height-percent:0" o:allowincell="f">
           <v:imagedata r:id="rId1" o:title="LOGO STIHA ADHYAKSA-02 (1)" gain="19661f" blacklevel="22938f"/>
           <w10:wrap anchorx="margin" anchory="margin"/>
         </v:shape>
@@ -1147,7 +1131,7 @@
       <w:rPr>
         <w:noProof/>
       </w:rPr>
-      <w:pict w14:anchorId="7945A412">
+      <w:pict w14:anchorId="4640BC67">
         <v:shapetype id="_x0000_t75" coordsize="21600,21600" o:spt="75" o:preferrelative="t" path="m@4@5l@4@11@9@11@9@5xe" filled="f" stroked="f">
           <v:stroke joinstyle="miter"/>
           <v:formulas>
@@ -1167,7 +1151,7 @@
           <v:path o:extrusionok="f" gradientshapeok="t" o:connecttype="rect"/>
           <o:lock v:ext="edit" aspectratio="t"/>
         </v:shapetype>
-        <v:shape id="WordPictureWatermark599527312" o:spid="_x0000_s1025" type="#_x0000_t75" style="position:absolute;margin-left:0;margin-top:0;width:466.35pt;height:466.25pt;z-index:-251656192;mso-position-horizontal:center;mso-position-horizontal-relative:margin;mso-position-vertical:center;mso-position-vertical-relative:margin" o:allowincell="f">
+        <v:shape id="WordPictureWatermark599527312" o:spid="_x0000_s1025" type="#_x0000_t75" alt="" style="position:absolute;margin-left:0;margin-top:0;width:466.35pt;height:466.25pt;z-index:-251656192;mso-wrap-edited:f;mso-width-percent:0;mso-height-percent:0;mso-position-horizontal:center;mso-position-horizontal-relative:margin;mso-position-vertical:center;mso-position-vertical-relative:margin;mso-width-percent:0;mso-height-percent:0" o:allowincell="f">
           <v:imagedata r:id="rId1" o:title="LOGO STIHA ADHYAKSA-02 (1)" gain="19661f" blacklevel="22938f"/>
           <w10:wrap anchorx="margin" anchory="margin"/>
         </v:shape>

</xml_diff>